<commit_message>
code refactoring and schemes update
</commit_message>
<xml_diff>
--- a/doc_tables/best_cats_NO2_alkoh.docx
+++ b/doc_tables/best_cats_NO2_alkoh.docx
@@ -392,6 +392,88 @@
           </w:tcPr>
           <w:p>
             <w:r>
+              <w:t>Ir</w:t>
+            </w:r>
+          </w:p>
+        </w:tc>
+        <w:tc>
+          <w:tcPr>
+            <w:tcW w:type="dxa" w:w="1080"/>
+          </w:tcPr>
+          <w:p>
+            <w:r>
+              <w:t>1</w:t>
+            </w:r>
+          </w:p>
+        </w:tc>
+        <w:tc>
+          <w:tcPr>
+            <w:tcW w:type="dxa" w:w="1080"/>
+          </w:tcPr>
+          <w:p>
+            <w:r>
+              <w:t>(108/130.0°C/K2CO3/Cp*Ir(N^N)Cl2/inert/10.1021/acs.joc.1c02625/2021)</w:t>
+            </w:r>
+          </w:p>
+        </w:tc>
+        <w:tc>
+          <w:tcPr>
+            <w:tcW w:type="dxa" w:w="1080"/>
+          </w:tcPr>
+          <w:p>
+            <w:r>
+              <w:t>(108/130.0°C/K2CO3/Cp*Ir(N^N)Cl2/inert/10.1021/acs.joc.1c02625/2021)</w:t>
+            </w:r>
+          </w:p>
+        </w:tc>
+        <w:tc>
+          <w:tcPr>
+            <w:tcW w:type="dxa" w:w="1080"/>
+          </w:tcPr>
+          <w:p>
+            <w:r>
+              <w:t>(108/130.0°C/K2CO3/Cp*Ir(N^N)Cl2/inert/10.1021/acs.joc.1c02625/2021)</w:t>
+            </w:r>
+          </w:p>
+        </w:tc>
+        <w:tc>
+          <w:tcPr>
+            <w:tcW w:type="dxa" w:w="1080"/>
+          </w:tcPr>
+          <w:p>
+            <w:r>
+              <w:t>no data</w:t>
+            </w:r>
+          </w:p>
+        </w:tc>
+        <w:tc>
+          <w:tcPr>
+            <w:tcW w:type="dxa" w:w="1080"/>
+          </w:tcPr>
+          <w:p>
+            <w:r>
+              <w:t>no data</w:t>
+            </w:r>
+          </w:p>
+        </w:tc>
+        <w:tc>
+          <w:tcPr>
+            <w:tcW w:type="dxa" w:w="1080"/>
+          </w:tcPr>
+          <w:p>
+            <w:r>
+              <w:t>['K2CO3']</w:t>
+            </w:r>
+          </w:p>
+        </w:tc>
+      </w:tr>
+      <w:tr>
+        <w:tc>
+          <w:tcPr>
+            <w:tcW w:type="dxa" w:w="1080"/>
+          </w:tcPr>
+          <w:p>
+            <w:r>
               <w:t>Pd</w:t>
             </w:r>
           </w:p>
@@ -545,88 +627,6 @@
           <w:p>
             <w:r>
               <w:t>['Cs2CO3']</w:t>
-            </w:r>
-          </w:p>
-        </w:tc>
-      </w:tr>
-      <w:tr>
-        <w:tc>
-          <w:tcPr>
-            <w:tcW w:type="dxa" w:w="1080"/>
-          </w:tcPr>
-          <w:p>
-            <w:r>
-              <w:t>Ir</w:t>
-            </w:r>
-          </w:p>
-        </w:tc>
-        <w:tc>
-          <w:tcPr>
-            <w:tcW w:type="dxa" w:w="1080"/>
-          </w:tcPr>
-          <w:p>
-            <w:r>
-              <w:t>1</w:t>
-            </w:r>
-          </w:p>
-        </w:tc>
-        <w:tc>
-          <w:tcPr>
-            <w:tcW w:type="dxa" w:w="1080"/>
-          </w:tcPr>
-          <w:p>
-            <w:r>
-              <w:t>(108/130.0°C/K2CO3/Cp*Ir(N^N)Cl2/inert/10.1021/acs.joc.1c02625/2021)</w:t>
-            </w:r>
-          </w:p>
-        </w:tc>
-        <w:tc>
-          <w:tcPr>
-            <w:tcW w:type="dxa" w:w="1080"/>
-          </w:tcPr>
-          <w:p>
-            <w:r>
-              <w:t>(108/130.0°C/K2CO3/Cp*Ir(N^N)Cl2/inert/10.1021/acs.joc.1c02625/2021)</w:t>
-            </w:r>
-          </w:p>
-        </w:tc>
-        <w:tc>
-          <w:tcPr>
-            <w:tcW w:type="dxa" w:w="1080"/>
-          </w:tcPr>
-          <w:p>
-            <w:r>
-              <w:t>(108/130.0°C/K2CO3/Cp*Ir(N^N)Cl2/inert/10.1021/acs.joc.1c02625/2021)</w:t>
-            </w:r>
-          </w:p>
-        </w:tc>
-        <w:tc>
-          <w:tcPr>
-            <w:tcW w:type="dxa" w:w="1080"/>
-          </w:tcPr>
-          <w:p>
-            <w:r>
-              <w:t>no data</w:t>
-            </w:r>
-          </w:p>
-        </w:tc>
-        <w:tc>
-          <w:tcPr>
-            <w:tcW w:type="dxa" w:w="1080"/>
-          </w:tcPr>
-          <w:p>
-            <w:r>
-              <w:t>no data</w:t>
-            </w:r>
-          </w:p>
-        </w:tc>
-        <w:tc>
-          <w:tcPr>
-            <w:tcW w:type="dxa" w:w="1080"/>
-          </w:tcPr>
-          <w:p>
-            <w:r>
-              <w:t>['K2CO3']</w:t>
             </w:r>
           </w:p>
         </w:tc>

</xml_diff>